<commit_message>
feat: implement interactive Cybersecurity Knowledge Hub & prep gitignore
</commit_message>
<xml_diff>
--- a/snaketank tools.docx
+++ b/snaketank tools.docx
@@ -2,19 +2,46 @@
 <file path=word/document.xml><?xml version="1.0" encoding="utf-8"?>
 <w:document xmlns:wpc="http://schemas.microsoft.com/office/word/2010/wordprocessingCanvas" xmlns:cx="http://schemas.microsoft.com/office/drawing/2014/chartex" xmlns:cx1="http://schemas.microsoft.com/office/drawing/2015/9/8/chartex" xmlns:cx2="http://schemas.microsoft.com/office/drawing/2015/10/21/chartex" xmlns:cx3="http://schemas.microsoft.com/office/drawing/2016/5/9/chartex" xmlns:cx4="http://schemas.microsoft.com/office/drawing/2016/5/10/chartex" xmlns:cx5="http://schemas.microsoft.com/office/drawing/2016/5/11/chartex" xmlns:cx6="http://schemas.microsoft.com/office/drawing/2016/5/12/chartex" xmlns:cx7="http://schemas.microsoft.com/office/drawing/2016/5/13/chartex" xmlns:cx8="http://schemas.microsoft.com/office/drawing/2016/5/14/chartex" xmlns:mc="http://schemas.openxmlformats.org/markup-compatibility/2006" xmlns:aink="http://schemas.microsoft.com/office/drawing/2016/ink" xmlns:am3d="http://schemas.microsoft.com/office/drawing/2017/model3d" xmlns:o="urn:schemas-microsoft-com:office:office" xmlns:oel="http://schemas.microsoft.com/office/2019/extlst" xmlns:r="http://schemas.openxmlformats.org/officeDocument/2006/relationships" xmlns:m="http://schemas.openxmlformats.org/officeDocument/2006/math" xmlns:v="urn:schemas-microsoft-com:vml" xmlns:wp14="http://schemas.microsoft.com/office/word/2010/wordprocessingDrawing" xmlns:wp="http://schemas.openxmlformats.org/drawingml/2006/wordprocessingDrawing" xmlns:w10="urn:schemas-microsoft-com:office:word" xmlns:w="http://schemas.openxmlformats.org/wordprocessingml/2006/main" xmlns:w14="http://schemas.microsoft.com/office/word/2010/wordml" xmlns:w15="http://schemas.microsoft.com/office/word/2012/wordml" xmlns:w16cex="http://schemas.microsoft.com/office/word/2018/wordml/cex" xmlns:w16cid="http://schemas.microsoft.com/office/word/2016/wordml/cid" xmlns:w16="http://schemas.microsoft.com/office/word/2018/wordml" xmlns:w16du="http://schemas.microsoft.com/office/word/2023/wordml/word16du" xmlns:w16sdtdh="http://schemas.microsoft.com/office/word/2020/wordml/sdtdatahash" xmlns:w16sdtfl="http://schemas.microsoft.com/office/word/2024/wordml/sdtformatlock" xmlns:w16se="http://schemas.microsoft.com/office/word/2015/wordml/symex" xmlns:wpg="http://schemas.microsoft.com/office/word/2010/wordprocessingGroup" xmlns:wpi="http://schemas.microsoft.com/office/word/2010/wordprocessingInk" xmlns:wne="http://schemas.microsoft.com/office/word/2006/wordml" xmlns:wps="http://schemas.microsoft.com/office/word/2010/wordprocessingShape" mc:Ignorable="w14 w15 w16se w16cid w16 w16cex w16sdtdh w16sdtfl w16du wp14">
   <w:body>
-    <w:p/>
-    <w:p/>
-    <w:p/>
-    <w:p>
+    <w:p>
+      <w:r>
+        <w:br/>
+        <w:t xml:space="preserve">Define common vulnerabilities of the selected OS for </w:t>
+      </w:r>
+      <w:r>
+        <w:rPr>
+          <w:b/>
+          <w:bCs/>
+        </w:rPr>
+        <w:t xml:space="preserve">FIVE (5) </w:t>
+      </w:r>
+      <w:r>
+        <w:t>vulnerabilities. Discuss the vulnerabilities, threat, attack vectors and impact/risk likelihood scoring (CVSS). Use proper citation and referencing.</w:t>
+      </w:r>
+    </w:p>
+    <w:p>
+      <w:r>
+        <w:t xml:space="preserve">Scanning result .. </w:t>
+      </w:r>
+    </w:p>
+    <w:p>
+      <w:r>
+        <w:t>1.</w:t>
+      </w:r>
+      <w:r>
+        <w:br/>
+      </w:r>
+      <w:r>
+        <w:br/>
+      </w:r>
       <w:r>
         <w:rPr>
           <w:noProof/>
         </w:rPr>
         <w:drawing>
-          <wp:inline distT="0" distB="0" distL="0" distR="0" wp14:anchorId="61F8361A" wp14:editId="3D7058A9">
-            <wp:extent cx="5731510" cy="4485640"/>
+          <wp:inline distT="0" distB="0" distL="0" distR="0" wp14:anchorId="184BCF4B" wp14:editId="613B86CA">
+            <wp:extent cx="5731510" cy="4458335"/>
             <wp:effectExtent l="0" t="0" r="2540" b="0"/>
-            <wp:docPr id="753529525" name="Picture 1"/>
+            <wp:docPr id="105990572" name="Picture 1"/>
             <wp:cNvGraphicFramePr>
               <a:graphicFrameLocks xmlns:a="http://schemas.openxmlformats.org/drawingml/2006/main" noChangeAspect="1"/>
             </wp:cNvGraphicFramePr>
@@ -22,61 +49,7 @@
               <a:graphicData uri="http://schemas.openxmlformats.org/drawingml/2006/picture">
                 <pic:pic xmlns:pic="http://schemas.openxmlformats.org/drawingml/2006/picture">
                   <pic:nvPicPr>
-                    <pic:cNvPr id="753529525" name=""/>
-                    <pic:cNvPicPr/>
-                  </pic:nvPicPr>
-                  <pic:blipFill>
-                    <a:blip r:embed="rId4"/>
-                    <a:stretch>
-                      <a:fillRect/>
-                    </a:stretch>
-                  </pic:blipFill>
-                  <pic:spPr>
-                    <a:xfrm>
-                      <a:off x="0" y="0"/>
-                      <a:ext cx="5731510" cy="4485640"/>
-                    </a:xfrm>
-                    <a:prstGeom prst="rect">
-                      <a:avLst/>
-                    </a:prstGeom>
-                  </pic:spPr>
-                </pic:pic>
-              </a:graphicData>
-            </a:graphic>
-          </wp:inline>
-        </w:drawing>
-      </w:r>
-    </w:p>
-    <w:p/>
-    <w:p/>
-    <w:p/>
-    <w:p/>
-    <w:p/>
-    <w:p/>
-    <w:p/>
-    <w:p/>
-    <w:p/>
-    <w:p/>
-    <w:p/>
-    <w:p/>
-    <w:p>
-      <w:r>
-        <w:rPr>
-          <w:noProof/>
-        </w:rPr>
-        <w:drawing>
-          <wp:inline distT="0" distB="0" distL="0" distR="0" wp14:anchorId="41897809" wp14:editId="56B4A55E">
-            <wp:extent cx="5731510" cy="4416425"/>
-            <wp:effectExtent l="0" t="0" r="2540" b="3175"/>
-            <wp:docPr id="182515548" name="Picture 1"/>
-            <wp:cNvGraphicFramePr>
-              <a:graphicFrameLocks xmlns:a="http://schemas.openxmlformats.org/drawingml/2006/main" noChangeAspect="1"/>
-            </wp:cNvGraphicFramePr>
-            <a:graphic xmlns:a="http://schemas.openxmlformats.org/drawingml/2006/main">
-              <a:graphicData uri="http://schemas.openxmlformats.org/drawingml/2006/picture">
-                <pic:pic xmlns:pic="http://schemas.openxmlformats.org/drawingml/2006/picture">
-                  <pic:nvPicPr>
-                    <pic:cNvPr id="182515548" name=""/>
+                    <pic:cNvPr id="105990572" name=""/>
                     <pic:cNvPicPr/>
                   </pic:nvPicPr>
                   <pic:blipFill>
@@ -88,7 +61,7 @@
                   <pic:spPr>
                     <a:xfrm>
                       <a:off x="0" y="0"/>
-                      <a:ext cx="5731510" cy="4416425"/>
+                      <a:ext cx="5731510" cy="4458335"/>
                     </a:xfrm>
                     <a:prstGeom prst="rect">
                       <a:avLst/>
@@ -101,30 +74,30 @@
         </w:drawing>
       </w:r>
     </w:p>
-    <w:p/>
-    <w:p/>
-    <w:p/>
-    <w:p/>
-    <w:p/>
-    <w:p/>
-    <w:p/>
-    <w:p/>
-    <w:p/>
-    <w:p/>
-    <w:p/>
-    <w:p/>
-    <w:p/>
-    <w:p/>
-    <w:p>
-      <w:r>
-        <w:rPr>
-          <w:noProof/>
-        </w:rPr>
+    <w:p>
+      <w:r>
+        <w:t xml:space="preserve">After scan , this tools detect 10 type of </w:t>
+      </w:r>
+      <w:proofErr w:type="spellStart"/>
+      <w:r>
+        <w:t>vurnerablelity</w:t>
+      </w:r>
+      <w:proofErr w:type="spellEnd"/>
+      <w:r>
+        <w:t xml:space="preserve"> </w:t>
+      </w:r>
+    </w:p>
+    <w:p>
+      <w:r>
+        <w:rPr>
+          <w:noProof/>
+        </w:rPr>
+        <w:lastRenderedPageBreak/>
         <w:drawing>
-          <wp:inline distT="0" distB="0" distL="0" distR="0" wp14:anchorId="28BD74E8" wp14:editId="56E3AFBA">
-            <wp:extent cx="5731510" cy="4159250"/>
-            <wp:effectExtent l="0" t="0" r="2540" b="0"/>
-            <wp:docPr id="1073818674" name="Picture 1"/>
+          <wp:inline distT="0" distB="0" distL="0" distR="0" wp14:anchorId="7613D0A4" wp14:editId="29F93F16">
+            <wp:extent cx="5760720" cy="3345180"/>
+            <wp:effectExtent l="0" t="0" r="0" b="7620"/>
+            <wp:docPr id="1329287221" name="Picture 1"/>
             <wp:cNvGraphicFramePr>
               <a:graphicFrameLocks xmlns:a="http://schemas.openxmlformats.org/drawingml/2006/main" noChangeAspect="1"/>
             </wp:cNvGraphicFramePr>
@@ -132,7 +105,7 @@
               <a:graphicData uri="http://schemas.openxmlformats.org/drawingml/2006/picture">
                 <pic:pic xmlns:pic="http://schemas.openxmlformats.org/drawingml/2006/picture">
                   <pic:nvPicPr>
-                    <pic:cNvPr id="1073818674" name=""/>
+                    <pic:cNvPr id="1329287221" name=""/>
                     <pic:cNvPicPr/>
                   </pic:nvPicPr>
                   <pic:blipFill>
@@ -144,7 +117,7 @@
                   <pic:spPr>
                     <a:xfrm>
                       <a:off x="0" y="0"/>
-                      <a:ext cx="5731510" cy="4159250"/>
+                      <a:ext cx="5766158" cy="3348338"/>
                     </a:xfrm>
                     <a:prstGeom prst="rect">
                       <a:avLst/>
@@ -158,29 +131,30 @@
       </w:r>
     </w:p>
     <w:p/>
-    <w:p/>
-    <w:p/>
-    <w:p/>
-    <w:p/>
-    <w:p/>
-    <w:p/>
-    <w:p/>
-    <w:p/>
-    <w:p/>
-    <w:p/>
-    <w:p/>
-    <w:p/>
-    <w:p/>
-    <w:p>
+    <w:p>
+      <w:pPr>
+        <w:rPr>
+          <w:noProof/>
+        </w:rPr>
+      </w:pPr>
+      <w:r>
+        <w:t>2.</w:t>
+      </w:r>
+      <w:r>
+        <w:rPr>
+          <w:noProof/>
+        </w:rPr>
+        <w:t xml:space="preserve"> </w:t>
+      </w:r>
       <w:r>
         <w:rPr>
           <w:noProof/>
         </w:rPr>
         <w:drawing>
-          <wp:inline distT="0" distB="0" distL="0" distR="0" wp14:anchorId="14CCC251" wp14:editId="1A8EE81F">
-            <wp:extent cx="2762250" cy="5273039"/>
-            <wp:effectExtent l="0" t="0" r="0" b="4445"/>
-            <wp:docPr id="1139970460" name="Picture 1"/>
+          <wp:inline distT="0" distB="0" distL="0" distR="0" wp14:anchorId="006DE6ED" wp14:editId="2AD8CC65">
+            <wp:extent cx="5731510" cy="720090"/>
+            <wp:effectExtent l="0" t="0" r="2540" b="3810"/>
+            <wp:docPr id="1392902929" name="Picture 1"/>
             <wp:cNvGraphicFramePr>
               <a:graphicFrameLocks xmlns:a="http://schemas.openxmlformats.org/drawingml/2006/main" noChangeAspect="1"/>
             </wp:cNvGraphicFramePr>
@@ -188,7 +162,7 @@
               <a:graphicData uri="http://schemas.openxmlformats.org/drawingml/2006/picture">
                 <pic:pic xmlns:pic="http://schemas.openxmlformats.org/drawingml/2006/picture">
                   <pic:nvPicPr>
-                    <pic:cNvPr id="1139970460" name=""/>
+                    <pic:cNvPr id="1392902929" name=""/>
                     <pic:cNvPicPr/>
                   </pic:nvPicPr>
                   <pic:blipFill>
@@ -200,7 +174,7 @@
                   <pic:spPr>
                     <a:xfrm>
                       <a:off x="0" y="0"/>
-                      <a:ext cx="2770807" cy="5289374"/>
+                      <a:ext cx="5731510" cy="720090"/>
                     </a:xfrm>
                     <a:prstGeom prst="rect">
                       <a:avLst/>
@@ -213,25 +187,33 @@
         </w:drawing>
       </w:r>
     </w:p>
-    <w:p/>
-    <w:p/>
-    <w:p/>
-    <w:p/>
-    <w:p/>
-    <w:p/>
-    <w:p/>
-    <w:p/>
-    <w:p>
-      <w:r>
-        <w:rPr>
-          <w:noProof/>
-        </w:rPr>
-        <w:lastRenderedPageBreak/>
+    <w:p>
+      <w:pPr>
+        <w:rPr>
+          <w:noProof/>
+        </w:rPr>
+      </w:pPr>
+      <w:r>
+        <w:rPr>
+          <w:noProof/>
+        </w:rPr>
+        <w:t>3.</w:t>
+      </w:r>
+      <w:r>
+        <w:rPr>
+          <w:noProof/>
+        </w:rPr>
+        <w:t xml:space="preserve"> </w:t>
+      </w:r>
+      <w:r>
+        <w:rPr>
+          <w:noProof/>
+        </w:rPr>
         <w:drawing>
-          <wp:inline distT="0" distB="0" distL="0" distR="0" wp14:anchorId="1FDDCC7A" wp14:editId="599B4B5F">
-            <wp:extent cx="5731510" cy="1170940"/>
+          <wp:inline distT="0" distB="0" distL="0" distR="0" wp14:anchorId="1F8FC6CA" wp14:editId="021B413C">
+            <wp:extent cx="5731510" cy="1012190"/>
             <wp:effectExtent l="0" t="0" r="2540" b="0"/>
-            <wp:docPr id="380793385" name="Picture 1"/>
+            <wp:docPr id="936554920" name="Picture 1"/>
             <wp:cNvGraphicFramePr>
               <a:graphicFrameLocks xmlns:a="http://schemas.openxmlformats.org/drawingml/2006/main" noChangeAspect="1"/>
             </wp:cNvGraphicFramePr>
@@ -239,7 +221,7 @@
               <a:graphicData uri="http://schemas.openxmlformats.org/drawingml/2006/picture">
                 <pic:pic xmlns:pic="http://schemas.openxmlformats.org/drawingml/2006/picture">
                   <pic:nvPicPr>
-                    <pic:cNvPr id="380793385" name=""/>
+                    <pic:cNvPr id="1934594413" name=""/>
                     <pic:cNvPicPr/>
                   </pic:nvPicPr>
                   <pic:blipFill>
@@ -251,7 +233,7 @@
                   <pic:spPr>
                     <a:xfrm>
                       <a:off x="0" y="0"/>
-                      <a:ext cx="5731510" cy="1170940"/>
+                      <a:ext cx="5731510" cy="1012190"/>
                     </a:xfrm>
                     <a:prstGeom prst="rect">
                       <a:avLst/>
@@ -263,19 +245,34 @@
           </wp:inline>
         </w:drawing>
       </w:r>
-    </w:p>
-    <w:p/>
-    <w:p/>
-    <w:p>
+      <w:r>
+        <w:rPr>
+          <w:noProof/>
+        </w:rPr>
+        <w:br/>
+      </w:r>
+      <w:r>
+        <w:rPr>
+          <w:noProof/>
+        </w:rPr>
+        <w:br/>
+        <w:t>4.</w:t>
+      </w:r>
+      <w:r>
+        <w:rPr>
+          <w:noProof/>
+        </w:rPr>
+        <w:t xml:space="preserve"> </w:t>
+      </w:r>
       <w:r>
         <w:rPr>
           <w:noProof/>
         </w:rPr>
         <w:drawing>
-          <wp:inline distT="0" distB="0" distL="0" distR="0" wp14:anchorId="0543BBE9" wp14:editId="3510F990">
-            <wp:extent cx="5731510" cy="1367155"/>
-            <wp:effectExtent l="0" t="0" r="2540" b="4445"/>
-            <wp:docPr id="610363020" name="Picture 1"/>
+          <wp:inline distT="0" distB="0" distL="0" distR="0" wp14:anchorId="0F628FCF" wp14:editId="1E2270A6">
+            <wp:extent cx="5731510" cy="761365"/>
+            <wp:effectExtent l="0" t="0" r="2540" b="635"/>
+            <wp:docPr id="706284991" name="Picture 1"/>
             <wp:cNvGraphicFramePr>
               <a:graphicFrameLocks xmlns:a="http://schemas.openxmlformats.org/drawingml/2006/main" noChangeAspect="1"/>
             </wp:cNvGraphicFramePr>
@@ -283,7 +280,7 @@
               <a:graphicData uri="http://schemas.openxmlformats.org/drawingml/2006/picture">
                 <pic:pic xmlns:pic="http://schemas.openxmlformats.org/drawingml/2006/picture">
                   <pic:nvPicPr>
-                    <pic:cNvPr id="610363020" name=""/>
+                    <pic:cNvPr id="706284991" name=""/>
                     <pic:cNvPicPr/>
                   </pic:nvPicPr>
                   <pic:blipFill>
@@ -295,7 +292,7 @@
                   <pic:spPr>
                     <a:xfrm>
                       <a:off x="0" y="0"/>
-                      <a:ext cx="5731510" cy="1367155"/>
+                      <a:ext cx="5731510" cy="761365"/>
                     </a:xfrm>
                     <a:prstGeom prst="rect">
                       <a:avLst/>
@@ -308,18 +305,48 @@
         </w:drawing>
       </w:r>
     </w:p>
-    <w:p/>
-    <w:p/>
-    <w:p>
+    <w:p>
+      <w:pPr>
+        <w:rPr>
+          <w:noProof/>
+        </w:rPr>
+      </w:pPr>
+    </w:p>
+    <w:p>
+      <w:pPr>
+        <w:rPr>
+          <w:noProof/>
+        </w:rPr>
+      </w:pPr>
+    </w:p>
+    <w:p>
+      <w:pPr>
+        <w:rPr>
+          <w:noProof/>
+        </w:rPr>
+      </w:pPr>
+      <w:r>
+        <w:rPr>
+          <w:noProof/>
+        </w:rPr>
+        <w:lastRenderedPageBreak/>
+        <w:t>5.</w:t>
+      </w:r>
+      <w:r>
+        <w:rPr>
+          <w:noProof/>
+        </w:rPr>
+        <w:t xml:space="preserve"> </w:t>
+      </w:r>
       <w:r>
         <w:rPr>
           <w:noProof/>
         </w:rPr>
         <w:drawing>
-          <wp:inline distT="0" distB="0" distL="0" distR="0" wp14:anchorId="287CD876" wp14:editId="63A48C7D">
-            <wp:extent cx="5731510" cy="1443355"/>
-            <wp:effectExtent l="0" t="0" r="2540" b="4445"/>
-            <wp:docPr id="197867582" name="Picture 1"/>
+          <wp:inline distT="0" distB="0" distL="0" distR="0" wp14:anchorId="527A183E" wp14:editId="4796719B">
+            <wp:extent cx="5731510" cy="869950"/>
+            <wp:effectExtent l="0" t="0" r="2540" b="6350"/>
+            <wp:docPr id="552980766" name="Picture 1"/>
             <wp:cNvGraphicFramePr>
               <a:graphicFrameLocks xmlns:a="http://schemas.openxmlformats.org/drawingml/2006/main" noChangeAspect="1"/>
             </wp:cNvGraphicFramePr>
@@ -327,7 +354,7 @@
               <a:graphicData uri="http://schemas.openxmlformats.org/drawingml/2006/picture">
                 <pic:pic xmlns:pic="http://schemas.openxmlformats.org/drawingml/2006/picture">
                   <pic:nvPicPr>
-                    <pic:cNvPr id="197867582" name=""/>
+                    <pic:cNvPr id="552980766" name=""/>
                     <pic:cNvPicPr/>
                   </pic:nvPicPr>
                   <pic:blipFill>
@@ -339,7 +366,7 @@
                   <pic:spPr>
                     <a:xfrm>
                       <a:off x="0" y="0"/>
-                      <a:ext cx="5731510" cy="1443355"/>
+                      <a:ext cx="5731510" cy="869950"/>
                     </a:xfrm>
                     <a:prstGeom prst="rect">
                       <a:avLst/>
@@ -352,18 +379,40 @@
         </w:drawing>
       </w:r>
     </w:p>
-    <w:p/>
-    <w:p/>
-    <w:p>
+    <w:p>
+      <w:pPr>
+        <w:rPr>
+          <w:noProof/>
+        </w:rPr>
+      </w:pPr>
+    </w:p>
+    <w:p>
+      <w:pPr>
+        <w:rPr>
+          <w:noProof/>
+        </w:rPr>
+      </w:pPr>
+      <w:r>
+        <w:rPr>
+          <w:noProof/>
+        </w:rPr>
+        <w:t>6.</w:t>
+      </w:r>
+      <w:r>
+        <w:rPr>
+          <w:noProof/>
+        </w:rPr>
+        <w:t xml:space="preserve"> </w:t>
+      </w:r>
       <w:r>
         <w:rPr>
           <w:noProof/>
         </w:rPr>
         <w:drawing>
-          <wp:inline distT="0" distB="0" distL="0" distR="0" wp14:anchorId="277BFB00" wp14:editId="63CF1234">
-            <wp:extent cx="5731510" cy="1420495"/>
-            <wp:effectExtent l="0" t="0" r="2540" b="8255"/>
-            <wp:docPr id="292417359" name="Picture 1"/>
+          <wp:inline distT="0" distB="0" distL="0" distR="0" wp14:anchorId="622AFD5F" wp14:editId="267AA15D">
+            <wp:extent cx="5731510" cy="679450"/>
+            <wp:effectExtent l="0" t="0" r="2540" b="6350"/>
+            <wp:docPr id="1759004457" name="Picture 1"/>
             <wp:cNvGraphicFramePr>
               <a:graphicFrameLocks xmlns:a="http://schemas.openxmlformats.org/drawingml/2006/main" noChangeAspect="1"/>
             </wp:cNvGraphicFramePr>
@@ -371,7 +420,7 @@
               <a:graphicData uri="http://schemas.openxmlformats.org/drawingml/2006/picture">
                 <pic:pic xmlns:pic="http://schemas.openxmlformats.org/drawingml/2006/picture">
                   <pic:nvPicPr>
-                    <pic:cNvPr id="292417359" name=""/>
+                    <pic:cNvPr id="1759004457" name=""/>
                     <pic:cNvPicPr/>
                   </pic:nvPicPr>
                   <pic:blipFill>
@@ -383,7 +432,7 @@
                   <pic:spPr>
                     <a:xfrm>
                       <a:off x="0" y="0"/>
-                      <a:ext cx="5731510" cy="1420495"/>
+                      <a:ext cx="5731510" cy="679450"/>
                     </a:xfrm>
                     <a:prstGeom prst="rect">
                       <a:avLst/>
@@ -396,19 +445,212 @@
         </w:drawing>
       </w:r>
     </w:p>
-    <w:p/>
-    <w:p/>
-    <w:p>
-      <w:r>
-        <w:rPr>
-          <w:noProof/>
-        </w:rPr>
-        <w:lastRenderedPageBreak/>
+    <w:p>
+      <w:pPr>
+        <w:rPr>
+          <w:noProof/>
+        </w:rPr>
+      </w:pPr>
+    </w:p>
+    <w:p>
+      <w:pPr>
+        <w:rPr>
+          <w:noProof/>
+        </w:rPr>
+      </w:pPr>
+    </w:p>
+    <w:p>
+      <w:pPr>
+        <w:rPr>
+          <w:noProof/>
+        </w:rPr>
+      </w:pPr>
+    </w:p>
+    <w:p>
+      <w:pPr>
+        <w:rPr>
+          <w:noProof/>
+        </w:rPr>
+      </w:pPr>
+    </w:p>
+    <w:p>
+      <w:pPr>
+        <w:rPr>
+          <w:noProof/>
+        </w:rPr>
+      </w:pPr>
+    </w:p>
+    <w:p>
+      <w:pPr>
+        <w:rPr>
+          <w:noProof/>
+        </w:rPr>
+      </w:pPr>
+    </w:p>
+    <w:p>
+      <w:pPr>
+        <w:rPr>
+          <w:noProof/>
+        </w:rPr>
+      </w:pPr>
+    </w:p>
+    <w:p>
+      <w:pPr>
+        <w:rPr>
+          <w:noProof/>
+        </w:rPr>
+      </w:pPr>
+    </w:p>
+    <w:p>
+      <w:pPr>
+        <w:rPr>
+          <w:noProof/>
+        </w:rPr>
+      </w:pPr>
+    </w:p>
+    <w:p>
+      <w:pPr>
+        <w:rPr>
+          <w:noProof/>
+        </w:rPr>
+      </w:pPr>
+    </w:p>
+    <w:p>
+      <w:pPr>
+        <w:rPr>
+          <w:noProof/>
+        </w:rPr>
+      </w:pPr>
+    </w:p>
+    <w:p>
+      <w:pPr>
+        <w:rPr>
+          <w:noProof/>
+        </w:rPr>
+      </w:pPr>
+    </w:p>
+    <w:p>
+      <w:pPr>
+        <w:rPr>
+          <w:noProof/>
+        </w:rPr>
+      </w:pPr>
+    </w:p>
+    <w:p>
+      <w:pPr>
+        <w:rPr>
+          <w:noProof/>
+        </w:rPr>
+      </w:pPr>
+    </w:p>
+    <w:p>
+      <w:pPr>
+        <w:rPr>
+          <w:noProof/>
+        </w:rPr>
+      </w:pPr>
+    </w:p>
+    <w:p>
+      <w:pPr>
+        <w:rPr>
+          <w:noProof/>
+        </w:rPr>
+      </w:pPr>
+    </w:p>
+    <w:p>
+      <w:pPr>
+        <w:rPr>
+          <w:noProof/>
+        </w:rPr>
+      </w:pPr>
+    </w:p>
+    <w:p>
+      <w:pPr>
+        <w:rPr>
+          <w:noProof/>
+        </w:rPr>
+      </w:pPr>
+    </w:p>
+    <w:p>
+      <w:pPr>
+        <w:rPr>
+          <w:noProof/>
+        </w:rPr>
+      </w:pPr>
+    </w:p>
+    <w:p>
+      <w:pPr>
+        <w:rPr>
+          <w:noProof/>
+        </w:rPr>
+      </w:pPr>
+    </w:p>
+    <w:p>
+      <w:pPr>
+        <w:rPr>
+          <w:noProof/>
+        </w:rPr>
+      </w:pPr>
+    </w:p>
+    <w:p>
+      <w:pPr>
+        <w:rPr>
+          <w:noProof/>
+        </w:rPr>
+      </w:pPr>
+    </w:p>
+    <w:p>
+      <w:pPr>
+        <w:rPr>
+          <w:noProof/>
+        </w:rPr>
+      </w:pPr>
+    </w:p>
+    <w:p>
+      <w:pPr>
+        <w:rPr>
+          <w:noProof/>
+        </w:rPr>
+      </w:pPr>
+    </w:p>
+    <w:p>
+      <w:pPr>
+        <w:rPr>
+          <w:noProof/>
+        </w:rPr>
+      </w:pPr>
+      <w:r>
+        <w:rPr>
+          <w:noProof/>
+        </w:rPr>
+        <w:t xml:space="preserve">Hardening </w:t>
+      </w:r>
+    </w:p>
+    <w:p>
+      <w:pPr>
+        <w:pStyle w:val="ListParagraph"/>
+        <w:numPr>
+          <w:ilvl w:val="0"/>
+          <w:numId w:val="1"/>
+        </w:numPr>
+        <w:rPr>
+          <w:noProof/>
+        </w:rPr>
+      </w:pPr>
+      <w:r>
+        <w:rPr>
+          <w:noProof/>
+        </w:rPr>
+        <w:t xml:space="preserve">Firewall </w:t>
+      </w:r>
+    </w:p>
+    <w:p>
+      <w:r>
         <w:drawing>
-          <wp:inline distT="0" distB="0" distL="0" distR="0" wp14:anchorId="1C9D2E22" wp14:editId="40464347">
-            <wp:extent cx="5731510" cy="1420495"/>
-            <wp:effectExtent l="0" t="0" r="2540" b="8255"/>
-            <wp:docPr id="16980227" name="Picture 1"/>
+          <wp:inline distT="0" distB="0" distL="0" distR="0" wp14:anchorId="051EEE66" wp14:editId="3680BD12">
+            <wp:extent cx="5731510" cy="1017905"/>
+            <wp:effectExtent l="0" t="0" r="2540" b="0"/>
+            <wp:docPr id="90839548" name="Picture 1"/>
             <wp:cNvGraphicFramePr>
               <a:graphicFrameLocks xmlns:a="http://schemas.openxmlformats.org/drawingml/2006/main" noChangeAspect="1"/>
             </wp:cNvGraphicFramePr>
@@ -416,7 +658,7 @@
               <a:graphicData uri="http://schemas.openxmlformats.org/drawingml/2006/picture">
                 <pic:pic xmlns:pic="http://schemas.openxmlformats.org/drawingml/2006/picture">
                   <pic:nvPicPr>
-                    <pic:cNvPr id="16980227" name=""/>
+                    <pic:cNvPr id="90839548" name=""/>
                     <pic:cNvPicPr/>
                   </pic:nvPicPr>
                   <pic:blipFill>
@@ -428,7 +670,7 @@
                   <pic:spPr>
                     <a:xfrm>
                       <a:off x="0" y="0"/>
-                      <a:ext cx="5731510" cy="1420495"/>
+                      <a:ext cx="5731510" cy="1017905"/>
                     </a:xfrm>
                     <a:prstGeom prst="rect">
                       <a:avLst/>
@@ -442,17 +684,13 @@
       </w:r>
     </w:p>
     <w:p/>
-    <w:p/>
-    <w:p>
-      <w:r>
-        <w:rPr>
-          <w:noProof/>
-        </w:rPr>
+    <w:p>
+      <w:r>
         <w:drawing>
-          <wp:inline distT="0" distB="0" distL="0" distR="0" wp14:anchorId="2B425D4A" wp14:editId="0F8D7470">
-            <wp:extent cx="5731510" cy="1371600"/>
-            <wp:effectExtent l="0" t="0" r="2540" b="0"/>
-            <wp:docPr id="2024649079" name="Picture 1"/>
+          <wp:inline distT="0" distB="0" distL="0" distR="0" wp14:anchorId="68DA2C3C" wp14:editId="18171B6D">
+            <wp:extent cx="5731510" cy="890270"/>
+            <wp:effectExtent l="0" t="0" r="2540" b="5080"/>
+            <wp:docPr id="1806543980" name="Picture 1"/>
             <wp:cNvGraphicFramePr>
               <a:graphicFrameLocks xmlns:a="http://schemas.openxmlformats.org/drawingml/2006/main" noChangeAspect="1"/>
             </wp:cNvGraphicFramePr>
@@ -460,7 +698,7 @@
               <a:graphicData uri="http://schemas.openxmlformats.org/drawingml/2006/picture">
                 <pic:pic xmlns:pic="http://schemas.openxmlformats.org/drawingml/2006/picture">
                   <pic:nvPicPr>
-                    <pic:cNvPr id="2024649079" name=""/>
+                    <pic:cNvPr id="1806543980" name=""/>
                     <pic:cNvPicPr/>
                   </pic:nvPicPr>
                   <pic:blipFill>
@@ -472,7 +710,7 @@
                   <pic:spPr>
                     <a:xfrm>
                       <a:off x="0" y="0"/>
-                      <a:ext cx="5731510" cy="1371600"/>
+                      <a:ext cx="5731510" cy="890270"/>
                     </a:xfrm>
                     <a:prstGeom prst="rect">
                       <a:avLst/>
@@ -488,14 +726,11 @@
     <w:p/>
     <w:p>
       <w:r>
-        <w:rPr>
-          <w:noProof/>
-        </w:rPr>
         <w:drawing>
-          <wp:inline distT="0" distB="0" distL="0" distR="0" wp14:anchorId="5E46A58F" wp14:editId="19F4FE52">
-            <wp:extent cx="5731510" cy="1794510"/>
+          <wp:inline distT="0" distB="0" distL="0" distR="0" wp14:anchorId="3C540724" wp14:editId="4FE58931">
+            <wp:extent cx="5731510" cy="805815"/>
             <wp:effectExtent l="0" t="0" r="2540" b="0"/>
-            <wp:docPr id="1806552419" name="Picture 1"/>
+            <wp:docPr id="1365154381" name="Picture 1"/>
             <wp:cNvGraphicFramePr>
               <a:graphicFrameLocks xmlns:a="http://schemas.openxmlformats.org/drawingml/2006/main" noChangeAspect="1"/>
             </wp:cNvGraphicFramePr>
@@ -503,7 +738,7 @@
               <a:graphicData uri="http://schemas.openxmlformats.org/drawingml/2006/picture">
                 <pic:pic xmlns:pic="http://schemas.openxmlformats.org/drawingml/2006/picture">
                   <pic:nvPicPr>
-                    <pic:cNvPr id="1806552419" name=""/>
+                    <pic:cNvPr id="1365154381" name=""/>
                     <pic:cNvPicPr/>
                   </pic:nvPicPr>
                   <pic:blipFill>
@@ -515,7 +750,7 @@
                   <pic:spPr>
                     <a:xfrm>
                       <a:off x="0" y="0"/>
-                      <a:ext cx="5731510" cy="1794510"/>
+                      <a:ext cx="5731510" cy="805815"/>
                     </a:xfrm>
                     <a:prstGeom prst="rect">
                       <a:avLst/>
@@ -530,16 +765,35 @@
     </w:p>
     <w:p/>
     <w:p/>
-    <w:p>
+    <w:p/>
+    <w:p/>
+    <w:p/>
+    <w:p/>
+    <w:p/>
+    <w:p/>
+    <w:p/>
+    <w:p/>
+    <w:p>
+      <w:r>
+        <w:lastRenderedPageBreak/>
+        <w:t>2.</w:t>
+      </w:r>
+    </w:p>
+    <w:p>
+      <w:pPr>
+        <w:rPr>
+          <w:noProof/>
+        </w:rPr>
+      </w:pPr>
       <w:r>
         <w:rPr>
           <w:noProof/>
         </w:rPr>
         <w:drawing>
-          <wp:inline distT="0" distB="0" distL="0" distR="0" wp14:anchorId="792C7C90" wp14:editId="218CC1F0">
-            <wp:extent cx="5731510" cy="1977390"/>
-            <wp:effectExtent l="0" t="0" r="2540" b="3810"/>
-            <wp:docPr id="539262266" name="Picture 1"/>
+          <wp:inline distT="0" distB="0" distL="0" distR="0" wp14:anchorId="11629581" wp14:editId="29043919">
+            <wp:extent cx="5731510" cy="1896110"/>
+            <wp:effectExtent l="0" t="0" r="2540" b="8890"/>
+            <wp:docPr id="1357587155" name="Picture 1"/>
             <wp:cNvGraphicFramePr>
               <a:graphicFrameLocks xmlns:a="http://schemas.openxmlformats.org/drawingml/2006/main" noChangeAspect="1"/>
             </wp:cNvGraphicFramePr>
@@ -547,7 +801,7 @@
               <a:graphicData uri="http://schemas.openxmlformats.org/drawingml/2006/picture">
                 <pic:pic xmlns:pic="http://schemas.openxmlformats.org/drawingml/2006/picture">
                   <pic:nvPicPr>
-                    <pic:cNvPr id="539262266" name=""/>
+                    <pic:cNvPr id="1357587155" name=""/>
                     <pic:cNvPicPr/>
                   </pic:nvPicPr>
                   <pic:blipFill>
@@ -559,7 +813,7 @@
                   <pic:spPr>
                     <a:xfrm>
                       <a:off x="0" y="0"/>
-                      <a:ext cx="5731510" cy="1977390"/>
+                      <a:ext cx="5731510" cy="1896110"/>
                     </a:xfrm>
                     <a:prstGeom prst="rect">
                       <a:avLst/>
@@ -572,19 +826,28 @@
         </w:drawing>
       </w:r>
     </w:p>
-    <w:p/>
-    <w:p/>
-    <w:p/>
-    <w:p>
+    <w:p>
+      <w:pPr>
+        <w:rPr>
+          <w:noProof/>
+        </w:rPr>
+      </w:pPr>
+    </w:p>
+    <w:p>
+      <w:pPr>
+        <w:rPr>
+          <w:noProof/>
+        </w:rPr>
+      </w:pPr>
       <w:r>
         <w:rPr>
           <w:noProof/>
         </w:rPr>
         <w:drawing>
-          <wp:inline distT="0" distB="0" distL="0" distR="0" wp14:anchorId="5763AB45" wp14:editId="640159A6">
-            <wp:extent cx="5731510" cy="2016760"/>
-            <wp:effectExtent l="0" t="0" r="2540" b="2540"/>
-            <wp:docPr id="735295503" name="Picture 1"/>
+          <wp:inline distT="0" distB="0" distL="0" distR="0" wp14:anchorId="20123F5D" wp14:editId="694366C0">
+            <wp:extent cx="5731510" cy="916940"/>
+            <wp:effectExtent l="0" t="0" r="2540" b="0"/>
+            <wp:docPr id="1969955762" name="Picture 1"/>
             <wp:cNvGraphicFramePr>
               <a:graphicFrameLocks xmlns:a="http://schemas.openxmlformats.org/drawingml/2006/main" noChangeAspect="1"/>
             </wp:cNvGraphicFramePr>
@@ -592,7 +855,7 @@
               <a:graphicData uri="http://schemas.openxmlformats.org/drawingml/2006/picture">
                 <pic:pic xmlns:pic="http://schemas.openxmlformats.org/drawingml/2006/picture">
                   <pic:nvPicPr>
-                    <pic:cNvPr id="735295503" name=""/>
+                    <pic:cNvPr id="1969955762" name=""/>
                     <pic:cNvPicPr/>
                   </pic:nvPicPr>
                   <pic:blipFill>
@@ -604,7 +867,7 @@
                   <pic:spPr>
                     <a:xfrm>
                       <a:off x="0" y="0"/>
-                      <a:ext cx="5731510" cy="2016760"/>
+                      <a:ext cx="5731510" cy="916940"/>
                     </a:xfrm>
                     <a:prstGeom prst="rect">
                       <a:avLst/>
@@ -617,18 +880,28 @@
         </w:drawing>
       </w:r>
     </w:p>
-    <w:p/>
-    <w:p/>
-    <w:p>
+    <w:p>
+      <w:pPr>
+        <w:rPr>
+          <w:noProof/>
+        </w:rPr>
+      </w:pPr>
+    </w:p>
+    <w:p>
+      <w:pPr>
+        <w:rPr>
+          <w:noProof/>
+        </w:rPr>
+      </w:pPr>
       <w:r>
         <w:rPr>
           <w:noProof/>
         </w:rPr>
         <w:drawing>
-          <wp:inline distT="0" distB="0" distL="0" distR="0" wp14:anchorId="3ABCB0AC" wp14:editId="6897C893">
-            <wp:extent cx="5731510" cy="2270125"/>
-            <wp:effectExtent l="0" t="0" r="2540" b="0"/>
-            <wp:docPr id="1261377711" name="Picture 1"/>
+          <wp:inline distT="0" distB="0" distL="0" distR="0" wp14:anchorId="01563709" wp14:editId="638A12C2">
+            <wp:extent cx="5037257" cy="3254022"/>
+            <wp:effectExtent l="0" t="0" r="0" b="3810"/>
+            <wp:docPr id="1911821084" name="Picture 1"/>
             <wp:cNvGraphicFramePr>
               <a:graphicFrameLocks xmlns:a="http://schemas.openxmlformats.org/drawingml/2006/main" noChangeAspect="1"/>
             </wp:cNvGraphicFramePr>
@@ -636,7 +909,7 @@
               <a:graphicData uri="http://schemas.openxmlformats.org/drawingml/2006/picture">
                 <pic:pic xmlns:pic="http://schemas.openxmlformats.org/drawingml/2006/picture">
                   <pic:nvPicPr>
-                    <pic:cNvPr id="1261377711" name=""/>
+                    <pic:cNvPr id="1911821084" name=""/>
                     <pic:cNvPicPr/>
                   </pic:nvPicPr>
                   <pic:blipFill>
@@ -648,7 +921,7 @@
                   <pic:spPr>
                     <a:xfrm>
                       <a:off x="0" y="0"/>
-                      <a:ext cx="5731510" cy="2270125"/>
+                      <a:ext cx="5037257" cy="3254022"/>
                     </a:xfrm>
                     <a:prstGeom prst="rect">
                       <a:avLst/>
@@ -661,17 +934,69 @@
         </w:drawing>
       </w:r>
     </w:p>
-    <w:p/>
-    <w:p>
+    <w:p>
+      <w:pPr>
+        <w:rPr>
+          <w:noProof/>
+        </w:rPr>
+      </w:pPr>
+    </w:p>
+    <w:p>
+      <w:pPr>
+        <w:rPr>
+          <w:noProof/>
+        </w:rPr>
+      </w:pPr>
+    </w:p>
+    <w:p>
+      <w:pPr>
+        <w:rPr>
+          <w:noProof/>
+        </w:rPr>
+      </w:pPr>
+    </w:p>
+    <w:p>
+      <w:pPr>
+        <w:rPr>
+          <w:noProof/>
+        </w:rPr>
+      </w:pPr>
+    </w:p>
+    <w:p>
+      <w:pPr>
+        <w:rPr>
+          <w:noProof/>
+        </w:rPr>
+      </w:pPr>
+      <w:r>
+        <w:rPr>
+          <w:noProof/>
+        </w:rPr>
+        <w:lastRenderedPageBreak/>
+        <w:t>3.</w:t>
+      </w:r>
+      <w:r>
+        <w:rPr>
+          <w:noProof/>
+        </w:rPr>
+        <w:t xml:space="preserve"> </w:t>
+      </w:r>
+    </w:p>
+    <w:p>
+      <w:pPr>
+        <w:rPr>
+          <w:noProof/>
+        </w:rPr>
+      </w:pPr>
       <w:r>
         <w:rPr>
           <w:noProof/>
         </w:rPr>
         <w:drawing>
-          <wp:inline distT="0" distB="0" distL="0" distR="0" wp14:anchorId="5CE5D9EF" wp14:editId="0C3D55D4">
-            <wp:extent cx="5731510" cy="1969770"/>
+          <wp:inline distT="0" distB="0" distL="0" distR="0" wp14:anchorId="3C5D9CCD" wp14:editId="4DA99B23">
+            <wp:extent cx="5731510" cy="558800"/>
             <wp:effectExtent l="0" t="0" r="2540" b="0"/>
-            <wp:docPr id="1277368904" name="Picture 1"/>
+            <wp:docPr id="936762862" name="Picture 1"/>
             <wp:cNvGraphicFramePr>
               <a:graphicFrameLocks xmlns:a="http://schemas.openxmlformats.org/drawingml/2006/main" noChangeAspect="1"/>
             </wp:cNvGraphicFramePr>
@@ -679,7 +1004,7 @@
               <a:graphicData uri="http://schemas.openxmlformats.org/drawingml/2006/picture">
                 <pic:pic xmlns:pic="http://schemas.openxmlformats.org/drawingml/2006/picture">
                   <pic:nvPicPr>
-                    <pic:cNvPr id="1277368904" name=""/>
+                    <pic:cNvPr id="936762862" name=""/>
                     <pic:cNvPicPr/>
                   </pic:nvPicPr>
                   <pic:blipFill>
@@ -691,7 +1016,7 @@
                   <pic:spPr>
                     <a:xfrm>
                       <a:off x="0" y="0"/>
-                      <a:ext cx="5731510" cy="1969770"/>
+                      <a:ext cx="5731510" cy="558800"/>
                     </a:xfrm>
                     <a:prstGeom prst="rect">
                       <a:avLst/>
@@ -704,15 +1029,16 @@
         </w:drawing>
       </w:r>
     </w:p>
-    <w:p/>
-    <w:p/>
-    <w:p>
+    <w:p>
+      <w:pPr>
+        <w:ind w:left="360"/>
+      </w:pPr>
       <w:r>
         <w:drawing>
-          <wp:inline distT="0" distB="0" distL="0" distR="0" wp14:anchorId="488E0D4B" wp14:editId="6369ACB0">
-            <wp:extent cx="5731510" cy="3028315"/>
-            <wp:effectExtent l="0" t="0" r="2540" b="635"/>
-            <wp:docPr id="510315414" name="Picture 1"/>
+          <wp:inline distT="0" distB="0" distL="0" distR="0" wp14:anchorId="64132378" wp14:editId="23208ECC">
+            <wp:extent cx="5461346" cy="1061720"/>
+            <wp:effectExtent l="0" t="0" r="6350" b="5080"/>
+            <wp:docPr id="1809350236" name="Picture 1"/>
             <wp:cNvGraphicFramePr>
               <a:graphicFrameLocks xmlns:a="http://schemas.openxmlformats.org/drawingml/2006/main" noChangeAspect="1"/>
             </wp:cNvGraphicFramePr>
@@ -720,7 +1046,7 @@
               <a:graphicData uri="http://schemas.openxmlformats.org/drawingml/2006/picture">
                 <pic:pic xmlns:pic="http://schemas.openxmlformats.org/drawingml/2006/picture">
                   <pic:nvPicPr>
-                    <pic:cNvPr id="510315414" name=""/>
+                    <pic:cNvPr id="1809350236" name=""/>
                     <pic:cNvPicPr/>
                   </pic:nvPicPr>
                   <pic:blipFill>
@@ -732,7 +1058,7 @@
                   <pic:spPr>
                     <a:xfrm>
                       <a:off x="0" y="0"/>
-                      <a:ext cx="5731510" cy="3028315"/>
+                      <a:ext cx="5467342" cy="1062886"/>
                     </a:xfrm>
                     <a:prstGeom prst="rect">
                       <a:avLst/>
@@ -745,14 +1071,34 @@
         </w:drawing>
       </w:r>
     </w:p>
-    <w:p/>
+    <w:p>
+      <w:pPr>
+        <w:ind w:left="360"/>
+      </w:pPr>
+    </w:p>
+    <w:p>
+      <w:pPr>
+        <w:rPr>
+          <w:noProof/>
+        </w:rPr>
+      </w:pPr>
+      <w:r>
+        <w:t>4.</w:t>
+      </w:r>
+      <w:r>
+        <w:rPr>
+          <w:noProof/>
+        </w:rPr>
+        <w:t xml:space="preserve"> </w:t>
+      </w:r>
+    </w:p>
     <w:p>
       <w:r>
         <w:drawing>
-          <wp:inline distT="0" distB="0" distL="0" distR="0" wp14:anchorId="7E8CDC5F" wp14:editId="69D74FDA">
-            <wp:extent cx="5731510" cy="1027430"/>
-            <wp:effectExtent l="0" t="0" r="2540" b="1270"/>
-            <wp:docPr id="694325726" name="Picture 1"/>
+          <wp:inline distT="0" distB="0" distL="0" distR="0" wp14:anchorId="68099283" wp14:editId="6C6F80CB">
+            <wp:extent cx="5731510" cy="838200"/>
+            <wp:effectExtent l="0" t="0" r="2540" b="0"/>
+            <wp:docPr id="726371753" name="Picture 1"/>
             <wp:cNvGraphicFramePr>
               <a:graphicFrameLocks xmlns:a="http://schemas.openxmlformats.org/drawingml/2006/main" noChangeAspect="1"/>
             </wp:cNvGraphicFramePr>
@@ -760,7 +1106,7 @@
               <a:graphicData uri="http://schemas.openxmlformats.org/drawingml/2006/picture">
                 <pic:pic xmlns:pic="http://schemas.openxmlformats.org/drawingml/2006/picture">
                   <pic:nvPicPr>
-                    <pic:cNvPr id="694325726" name=""/>
+                    <pic:cNvPr id="726371753" name=""/>
                     <pic:cNvPicPr/>
                   </pic:nvPicPr>
                   <pic:blipFill>
@@ -772,7 +1118,7 @@
                   <pic:spPr>
                     <a:xfrm>
                       <a:off x="0" y="0"/>
-                      <a:ext cx="5731510" cy="1027430"/>
+                      <a:ext cx="5731510" cy="838200"/>
                     </a:xfrm>
                     <a:prstGeom prst="rect">
                       <a:avLst/>
@@ -784,15 +1130,15 @@
           </wp:inline>
         </w:drawing>
       </w:r>
-    </w:p>
-    <w:p/>
-    <w:p>
-      <w:r>
+      <w:r>
+        <w:rPr>
+          <w:noProof/>
+        </w:rPr>
         <w:drawing>
-          <wp:inline distT="0" distB="0" distL="0" distR="0" wp14:anchorId="04B4F703" wp14:editId="0B9C334E">
-            <wp:extent cx="5731510" cy="972820"/>
-            <wp:effectExtent l="0" t="0" r="2540" b="0"/>
-            <wp:docPr id="1375410378" name="Picture 1"/>
+          <wp:inline distT="0" distB="0" distL="0" distR="0" wp14:anchorId="1B414EBA" wp14:editId="6EAF7351">
+            <wp:extent cx="5731510" cy="761365"/>
+            <wp:effectExtent l="0" t="0" r="2540" b="635"/>
+            <wp:docPr id="212664343" name="Picture 1"/>
             <wp:cNvGraphicFramePr>
               <a:graphicFrameLocks xmlns:a="http://schemas.openxmlformats.org/drawingml/2006/main" noChangeAspect="1"/>
             </wp:cNvGraphicFramePr>
@@ -800,7 +1146,46 @@
               <a:graphicData uri="http://schemas.openxmlformats.org/drawingml/2006/picture">
                 <pic:pic xmlns:pic="http://schemas.openxmlformats.org/drawingml/2006/picture">
                   <pic:nvPicPr>
-                    <pic:cNvPr id="1375410378" name=""/>
+                    <pic:cNvPr id="706284991" name=""/>
+                    <pic:cNvPicPr/>
+                  </pic:nvPicPr>
+                  <pic:blipFill>
+                    <a:blip r:embed="rId9"/>
+                    <a:stretch>
+                      <a:fillRect/>
+                    </a:stretch>
+                  </pic:blipFill>
+                  <pic:spPr>
+                    <a:xfrm>
+                      <a:off x="0" y="0"/>
+                      <a:ext cx="5731510" cy="761365"/>
+                    </a:xfrm>
+                    <a:prstGeom prst="rect">
+                      <a:avLst/>
+                    </a:prstGeom>
+                  </pic:spPr>
+                </pic:pic>
+              </a:graphicData>
+            </a:graphic>
+          </wp:inline>
+        </w:drawing>
+      </w:r>
+    </w:p>
+    <w:p>
+      <w:r>
+        <w:drawing>
+          <wp:inline distT="0" distB="0" distL="0" distR="0" wp14:anchorId="66AC92FD" wp14:editId="0FC97604">
+            <wp:extent cx="5731510" cy="631190"/>
+            <wp:effectExtent l="0" t="0" r="2540" b="0"/>
+            <wp:docPr id="901555200" name="Picture 1"/>
+            <wp:cNvGraphicFramePr>
+              <a:graphicFrameLocks xmlns:a="http://schemas.openxmlformats.org/drawingml/2006/main" noChangeAspect="1"/>
+            </wp:cNvGraphicFramePr>
+            <a:graphic xmlns:a="http://schemas.openxmlformats.org/drawingml/2006/main">
+              <a:graphicData uri="http://schemas.openxmlformats.org/drawingml/2006/picture">
+                <pic:pic xmlns:pic="http://schemas.openxmlformats.org/drawingml/2006/picture">
+                  <pic:nvPicPr>
+                    <pic:cNvPr id="901555200" name=""/>
                     <pic:cNvPicPr/>
                   </pic:nvPicPr>
                   <pic:blipFill>
@@ -812,7 +1197,7 @@
                   <pic:spPr>
                     <a:xfrm>
                       <a:off x="0" y="0"/>
-                      <a:ext cx="5731510" cy="972820"/>
+                      <a:ext cx="5731510" cy="631190"/>
                     </a:xfrm>
                     <a:prstGeom prst="rect">
                       <a:avLst/>
@@ -825,14 +1210,13 @@
         </w:drawing>
       </w:r>
     </w:p>
-    <w:p/>
     <w:p>
       <w:r>
         <w:drawing>
-          <wp:inline distT="0" distB="0" distL="0" distR="0" wp14:anchorId="1773B016" wp14:editId="0FE175EB">
-            <wp:extent cx="5731510" cy="1115060"/>
-            <wp:effectExtent l="0" t="0" r="2540" b="8890"/>
-            <wp:docPr id="1377851160" name="Picture 1"/>
+          <wp:inline distT="0" distB="0" distL="0" distR="0" wp14:anchorId="5669B5A7" wp14:editId="66676063">
+            <wp:extent cx="5731510" cy="988695"/>
+            <wp:effectExtent l="0" t="0" r="2540" b="1905"/>
+            <wp:docPr id="306800832" name="Picture 1"/>
             <wp:cNvGraphicFramePr>
               <a:graphicFrameLocks xmlns:a="http://schemas.openxmlformats.org/drawingml/2006/main" noChangeAspect="1"/>
             </wp:cNvGraphicFramePr>
@@ -840,7 +1224,7 @@
               <a:graphicData uri="http://schemas.openxmlformats.org/drawingml/2006/picture">
                 <pic:pic xmlns:pic="http://schemas.openxmlformats.org/drawingml/2006/picture">
                   <pic:nvPicPr>
-                    <pic:cNvPr id="1377851160" name=""/>
+                    <pic:cNvPr id="306800832" name=""/>
                     <pic:cNvPicPr/>
                   </pic:nvPicPr>
                   <pic:blipFill>
@@ -852,7 +1236,7 @@
                   <pic:spPr>
                     <a:xfrm>
                       <a:off x="0" y="0"/>
-                      <a:ext cx="5731510" cy="1115060"/>
+                      <a:ext cx="5731510" cy="988695"/>
                     </a:xfrm>
                     <a:prstGeom prst="rect">
                       <a:avLst/>
@@ -870,13 +1254,30 @@
     <w:p/>
     <w:p/>
     <w:p/>
-    <w:p>
+    <w:p/>
+    <w:p/>
+    <w:p>
+      <w:pPr>
+        <w:rPr>
+          <w:noProof/>
+        </w:rPr>
+      </w:pPr>
+      <w:r>
+        <w:lastRenderedPageBreak/>
+        <w:t>5.</w:t>
+      </w:r>
+      <w:r>
+        <w:rPr>
+          <w:noProof/>
+        </w:rPr>
+        <w:t xml:space="preserve"> </w:t>
+      </w:r>
       <w:r>
         <w:drawing>
-          <wp:inline distT="0" distB="0" distL="0" distR="0" wp14:anchorId="07ABE1DE" wp14:editId="0668A85F">
-            <wp:extent cx="5731510" cy="1406525"/>
-            <wp:effectExtent l="0" t="0" r="2540" b="3175"/>
-            <wp:docPr id="704061912" name="Picture 1"/>
+          <wp:inline distT="0" distB="0" distL="0" distR="0" wp14:anchorId="452E691C" wp14:editId="31D2FD0A">
+            <wp:extent cx="5731510" cy="621030"/>
+            <wp:effectExtent l="0" t="0" r="2540" b="7620"/>
+            <wp:docPr id="947730514" name="Picture 1"/>
             <wp:cNvGraphicFramePr>
               <a:graphicFrameLocks xmlns:a="http://schemas.openxmlformats.org/drawingml/2006/main" noChangeAspect="1"/>
             </wp:cNvGraphicFramePr>
@@ -884,7 +1285,7 @@
               <a:graphicData uri="http://schemas.openxmlformats.org/drawingml/2006/picture">
                 <pic:pic xmlns:pic="http://schemas.openxmlformats.org/drawingml/2006/picture">
                   <pic:nvPicPr>
-                    <pic:cNvPr id="704061912" name=""/>
+                    <pic:cNvPr id="947730514" name=""/>
                     <pic:cNvPicPr/>
                   </pic:nvPicPr>
                   <pic:blipFill>
@@ -896,7 +1297,7 @@
                   <pic:spPr>
                     <a:xfrm>
                       <a:off x="0" y="0"/>
-                      <a:ext cx="5731510" cy="1406525"/>
+                      <a:ext cx="5731510" cy="621030"/>
                     </a:xfrm>
                     <a:prstGeom prst="rect">
                       <a:avLst/>
@@ -909,15 +1310,13 @@
         </w:drawing>
       </w:r>
     </w:p>
-    <w:p/>
-    <w:p/>
     <w:p>
       <w:r>
         <w:drawing>
-          <wp:inline distT="0" distB="0" distL="0" distR="0" wp14:anchorId="0917680F" wp14:editId="2233C351">
-            <wp:extent cx="5731510" cy="1686560"/>
-            <wp:effectExtent l="0" t="0" r="2540" b="8890"/>
-            <wp:docPr id="257486259" name="Picture 1"/>
+          <wp:inline distT="0" distB="0" distL="0" distR="0" wp14:anchorId="64226914" wp14:editId="3CECE645">
+            <wp:extent cx="5731510" cy="628015"/>
+            <wp:effectExtent l="0" t="0" r="2540" b="635"/>
+            <wp:docPr id="1409623902" name="Picture 1"/>
             <wp:cNvGraphicFramePr>
               <a:graphicFrameLocks xmlns:a="http://schemas.openxmlformats.org/drawingml/2006/main" noChangeAspect="1"/>
             </wp:cNvGraphicFramePr>
@@ -925,7 +1324,7 @@
               <a:graphicData uri="http://schemas.openxmlformats.org/drawingml/2006/picture">
                 <pic:pic xmlns:pic="http://schemas.openxmlformats.org/drawingml/2006/picture">
                   <pic:nvPicPr>
-                    <pic:cNvPr id="257486259" name=""/>
+                    <pic:cNvPr id="1409623902" name=""/>
                     <pic:cNvPicPr/>
                   </pic:nvPicPr>
                   <pic:blipFill>
@@ -937,7 +1336,7 @@
                   <pic:spPr>
                     <a:xfrm>
                       <a:off x="0" y="0"/>
-                      <a:ext cx="5731510" cy="1686560"/>
+                      <a:ext cx="5731510" cy="628015"/>
                     </a:xfrm>
                     <a:prstGeom prst="rect">
                       <a:avLst/>
@@ -950,14 +1349,13 @@
         </w:drawing>
       </w:r>
     </w:p>
-    <w:p/>
     <w:p>
       <w:r>
         <w:drawing>
-          <wp:inline distT="0" distB="0" distL="0" distR="0" wp14:anchorId="74648D13" wp14:editId="50AEF2AE">
-            <wp:extent cx="5731510" cy="1297305"/>
+          <wp:inline distT="0" distB="0" distL="0" distR="0" wp14:anchorId="083A4543" wp14:editId="35191D42">
+            <wp:extent cx="5731510" cy="732155"/>
             <wp:effectExtent l="0" t="0" r="2540" b="0"/>
-            <wp:docPr id="650764698" name="Picture 1"/>
+            <wp:docPr id="1949110927" name="Picture 1"/>
             <wp:cNvGraphicFramePr>
               <a:graphicFrameLocks xmlns:a="http://schemas.openxmlformats.org/drawingml/2006/main" noChangeAspect="1"/>
             </wp:cNvGraphicFramePr>
@@ -965,7 +1363,7 @@
               <a:graphicData uri="http://schemas.openxmlformats.org/drawingml/2006/picture">
                 <pic:pic xmlns:pic="http://schemas.openxmlformats.org/drawingml/2006/picture">
                   <pic:nvPicPr>
-                    <pic:cNvPr id="650764698" name=""/>
+                    <pic:cNvPr id="1949110927" name=""/>
                     <pic:cNvPicPr/>
                   </pic:nvPicPr>
                   <pic:blipFill>
@@ -977,7 +1375,7 @@
                   <pic:spPr>
                     <a:xfrm>
                       <a:off x="0" y="0"/>
-                      <a:ext cx="5731510" cy="1297305"/>
+                      <a:ext cx="5731510" cy="732155"/>
                     </a:xfrm>
                     <a:prstGeom prst="rect">
                       <a:avLst/>
@@ -990,13 +1388,31 @@
         </w:drawing>
       </w:r>
     </w:p>
-    <w:p>
+    <w:p/>
+    <w:p/>
+    <w:p/>
+    <w:p/>
+    <w:p>
+      <w:pPr>
+        <w:rPr>
+          <w:noProof/>
+        </w:rPr>
+      </w:pPr>
+      <w:r>
+        <w:t>6.</w:t>
+      </w:r>
+      <w:r>
+        <w:rPr>
+          <w:noProof/>
+        </w:rPr>
+        <w:t xml:space="preserve"> </w:t>
+      </w:r>
       <w:r>
         <w:drawing>
-          <wp:inline distT="0" distB="0" distL="0" distR="0" wp14:anchorId="37DBC7DB" wp14:editId="429DBE8C">
-            <wp:extent cx="5731510" cy="977900"/>
-            <wp:effectExtent l="0" t="0" r="2540" b="0"/>
-            <wp:docPr id="1817498474" name="Picture 1"/>
+          <wp:inline distT="0" distB="0" distL="0" distR="0" wp14:anchorId="415B30CC" wp14:editId="462CCC49">
+            <wp:extent cx="5731510" cy="565150"/>
+            <wp:effectExtent l="0" t="0" r="2540" b="6350"/>
+            <wp:docPr id="456703062" name="Picture 1"/>
             <wp:cNvGraphicFramePr>
               <a:graphicFrameLocks xmlns:a="http://schemas.openxmlformats.org/drawingml/2006/main" noChangeAspect="1"/>
             </wp:cNvGraphicFramePr>
@@ -1004,7 +1420,7 @@
               <a:graphicData uri="http://schemas.openxmlformats.org/drawingml/2006/picture">
                 <pic:pic xmlns:pic="http://schemas.openxmlformats.org/drawingml/2006/picture">
                   <pic:nvPicPr>
-                    <pic:cNvPr id="1817498474" name=""/>
+                    <pic:cNvPr id="456703062" name=""/>
                     <pic:cNvPicPr/>
                   </pic:nvPicPr>
                   <pic:blipFill>
@@ -1016,7 +1432,7 @@
                   <pic:spPr>
                     <a:xfrm>
                       <a:off x="0" y="0"/>
-                      <a:ext cx="5731510" cy="977900"/>
+                      <a:ext cx="5731510" cy="565150"/>
                     </a:xfrm>
                     <a:prstGeom prst="rect">
                       <a:avLst/>
@@ -1029,19 +1445,13 @@
         </w:drawing>
       </w:r>
     </w:p>
-    <w:p/>
-    <w:p/>
-    <w:p/>
-    <w:p/>
-    <w:p/>
-    <w:p/>
     <w:p>
       <w:r>
         <w:drawing>
-          <wp:inline distT="0" distB="0" distL="0" distR="0" wp14:anchorId="7FF8C0F8" wp14:editId="1569EFA0">
-            <wp:extent cx="5731510" cy="1250315"/>
-            <wp:effectExtent l="0" t="0" r="2540" b="6985"/>
-            <wp:docPr id="661974880" name="Picture 1"/>
+          <wp:inline distT="0" distB="0" distL="0" distR="0" wp14:anchorId="376AE833" wp14:editId="2DFD855B">
+            <wp:extent cx="5731510" cy="2508250"/>
+            <wp:effectExtent l="0" t="0" r="2540" b="6350"/>
+            <wp:docPr id="118080030" name="Picture 1"/>
             <wp:cNvGraphicFramePr>
               <a:graphicFrameLocks xmlns:a="http://schemas.openxmlformats.org/drawingml/2006/main" noChangeAspect="1"/>
             </wp:cNvGraphicFramePr>
@@ -1049,7 +1459,7 @@
               <a:graphicData uri="http://schemas.openxmlformats.org/drawingml/2006/picture">
                 <pic:pic xmlns:pic="http://schemas.openxmlformats.org/drawingml/2006/picture">
                   <pic:nvPicPr>
-                    <pic:cNvPr id="661974880" name=""/>
+                    <pic:cNvPr id="118080030" name=""/>
                     <pic:cNvPicPr/>
                   </pic:nvPicPr>
                   <pic:blipFill>
@@ -1061,7 +1471,7 @@
                   <pic:spPr>
                     <a:xfrm>
                       <a:off x="0" y="0"/>
-                      <a:ext cx="5731510" cy="1250315"/>
+                      <a:ext cx="5731510" cy="2508250"/>
                     </a:xfrm>
                     <a:prstGeom prst="rect">
                       <a:avLst/>
@@ -1074,167 +1484,6 @@
         </w:drawing>
       </w:r>
     </w:p>
-    <w:p/>
-    <w:p/>
-    <w:p>
-      <w:r>
-        <w:drawing>
-          <wp:inline distT="0" distB="0" distL="0" distR="0" wp14:anchorId="730DE0F7" wp14:editId="78E16633">
-            <wp:extent cx="5731510" cy="1031875"/>
-            <wp:effectExtent l="0" t="0" r="2540" b="0"/>
-            <wp:docPr id="1091940522" name="Picture 1"/>
-            <wp:cNvGraphicFramePr>
-              <a:graphicFrameLocks xmlns:a="http://schemas.openxmlformats.org/drawingml/2006/main" noChangeAspect="1"/>
-            </wp:cNvGraphicFramePr>
-            <a:graphic xmlns:a="http://schemas.openxmlformats.org/drawingml/2006/main">
-              <a:graphicData uri="http://schemas.openxmlformats.org/drawingml/2006/picture">
-                <pic:pic xmlns:pic="http://schemas.openxmlformats.org/drawingml/2006/picture">
-                  <pic:nvPicPr>
-                    <pic:cNvPr id="1091940522" name=""/>
-                    <pic:cNvPicPr/>
-                  </pic:nvPicPr>
-                  <pic:blipFill>
-                    <a:blip r:embed="rId28"/>
-                    <a:stretch>
-                      <a:fillRect/>
-                    </a:stretch>
-                  </pic:blipFill>
-                  <pic:spPr>
-                    <a:xfrm>
-                      <a:off x="0" y="0"/>
-                      <a:ext cx="5731510" cy="1031875"/>
-                    </a:xfrm>
-                    <a:prstGeom prst="rect">
-                      <a:avLst/>
-                    </a:prstGeom>
-                  </pic:spPr>
-                </pic:pic>
-              </a:graphicData>
-            </a:graphic>
-          </wp:inline>
-        </w:drawing>
-      </w:r>
-    </w:p>
-    <w:p/>
-    <w:p>
-      <w:r>
-        <w:drawing>
-          <wp:inline distT="0" distB="0" distL="0" distR="0" wp14:anchorId="5C7CF9BC" wp14:editId="135DAFB0">
-            <wp:extent cx="5731510" cy="387350"/>
-            <wp:effectExtent l="0" t="0" r="2540" b="0"/>
-            <wp:docPr id="1662032026" name="Picture 1"/>
-            <wp:cNvGraphicFramePr>
-              <a:graphicFrameLocks xmlns:a="http://schemas.openxmlformats.org/drawingml/2006/main" noChangeAspect="1"/>
-            </wp:cNvGraphicFramePr>
-            <a:graphic xmlns:a="http://schemas.openxmlformats.org/drawingml/2006/main">
-              <a:graphicData uri="http://schemas.openxmlformats.org/drawingml/2006/picture">
-                <pic:pic xmlns:pic="http://schemas.openxmlformats.org/drawingml/2006/picture">
-                  <pic:nvPicPr>
-                    <pic:cNvPr id="1662032026" name=""/>
-                    <pic:cNvPicPr/>
-                  </pic:nvPicPr>
-                  <pic:blipFill>
-                    <a:blip r:embed="rId29"/>
-                    <a:stretch>
-                      <a:fillRect/>
-                    </a:stretch>
-                  </pic:blipFill>
-                  <pic:spPr>
-                    <a:xfrm>
-                      <a:off x="0" y="0"/>
-                      <a:ext cx="5731510" cy="387350"/>
-                    </a:xfrm>
-                    <a:prstGeom prst="rect">
-                      <a:avLst/>
-                    </a:prstGeom>
-                  </pic:spPr>
-                </pic:pic>
-              </a:graphicData>
-            </a:graphic>
-          </wp:inline>
-        </w:drawing>
-      </w:r>
-    </w:p>
-    <w:p/>
-    <w:p>
-      <w:r>
-        <w:drawing>
-          <wp:inline distT="0" distB="0" distL="0" distR="0" wp14:anchorId="7BF16192" wp14:editId="128B59A8">
-            <wp:extent cx="5731510" cy="1236980"/>
-            <wp:effectExtent l="0" t="0" r="2540" b="1270"/>
-            <wp:docPr id="2003167931" name="Picture 1"/>
-            <wp:cNvGraphicFramePr>
-              <a:graphicFrameLocks xmlns:a="http://schemas.openxmlformats.org/drawingml/2006/main" noChangeAspect="1"/>
-            </wp:cNvGraphicFramePr>
-            <a:graphic xmlns:a="http://schemas.openxmlformats.org/drawingml/2006/main">
-              <a:graphicData uri="http://schemas.openxmlformats.org/drawingml/2006/picture">
-                <pic:pic xmlns:pic="http://schemas.openxmlformats.org/drawingml/2006/picture">
-                  <pic:nvPicPr>
-                    <pic:cNvPr id="2003167931" name=""/>
-                    <pic:cNvPicPr/>
-                  </pic:nvPicPr>
-                  <pic:blipFill>
-                    <a:blip r:embed="rId30"/>
-                    <a:stretch>
-                      <a:fillRect/>
-                    </a:stretch>
-                  </pic:blipFill>
-                  <pic:spPr>
-                    <a:xfrm>
-                      <a:off x="0" y="0"/>
-                      <a:ext cx="5731510" cy="1236980"/>
-                    </a:xfrm>
-                    <a:prstGeom prst="rect">
-                      <a:avLst/>
-                    </a:prstGeom>
-                  </pic:spPr>
-                </pic:pic>
-              </a:graphicData>
-            </a:graphic>
-          </wp:inline>
-        </w:drawing>
-      </w:r>
-    </w:p>
-    <w:p/>
-    <w:p>
-      <w:r>
-        <w:drawing>
-          <wp:inline distT="0" distB="0" distL="0" distR="0" wp14:anchorId="36045C52" wp14:editId="4E051356">
-            <wp:extent cx="5731510" cy="671830"/>
-            <wp:effectExtent l="0" t="0" r="2540" b="0"/>
-            <wp:docPr id="290820797" name="Picture 1"/>
-            <wp:cNvGraphicFramePr>
-              <a:graphicFrameLocks xmlns:a="http://schemas.openxmlformats.org/drawingml/2006/main" noChangeAspect="1"/>
-            </wp:cNvGraphicFramePr>
-            <a:graphic xmlns:a="http://schemas.openxmlformats.org/drawingml/2006/main">
-              <a:graphicData uri="http://schemas.openxmlformats.org/drawingml/2006/picture">
-                <pic:pic xmlns:pic="http://schemas.openxmlformats.org/drawingml/2006/picture">
-                  <pic:nvPicPr>
-                    <pic:cNvPr id="290820797" name=""/>
-                    <pic:cNvPicPr/>
-                  </pic:nvPicPr>
-                  <pic:blipFill>
-                    <a:blip r:embed="rId31"/>
-                    <a:stretch>
-                      <a:fillRect/>
-                    </a:stretch>
-                  </pic:blipFill>
-                  <pic:spPr>
-                    <a:xfrm>
-                      <a:off x="0" y="0"/>
-                      <a:ext cx="5731510" cy="671830"/>
-                    </a:xfrm>
-                    <a:prstGeom prst="rect">
-                      <a:avLst/>
-                    </a:prstGeom>
-                  </pic:spPr>
-                </pic:pic>
-              </a:graphicData>
-            </a:graphic>
-          </wp:inline>
-        </w:drawing>
-      </w:r>
-    </w:p>
     <w:sectPr>
       <w:pgSz w:w="11906" w:h="16838"/>
       <w:pgMar w:top="1440" w:right="1440" w:bottom="1440" w:left="1440" w:header="708" w:footer="708" w:gutter="0"/>
@@ -1243,6 +1492,103 @@
     </w:sectPr>
   </w:body>
 </w:document>
+</file>
+
+<file path=word/numbering.xml><?xml version="1.0" encoding="utf-8"?>
+<w:numbering xmlns:wpc="http://schemas.microsoft.com/office/word/2010/wordprocessingCanvas" xmlns:cx="http://schemas.microsoft.com/office/drawing/2014/chartex" xmlns:cx1="http://schemas.microsoft.com/office/drawing/2015/9/8/chartex" xmlns:cx2="http://schemas.microsoft.com/office/drawing/2015/10/21/chartex" xmlns:cx3="http://schemas.microsoft.com/office/drawing/2016/5/9/chartex" xmlns:cx4="http://schemas.microsoft.com/office/drawing/2016/5/10/chartex" xmlns:cx5="http://schemas.microsoft.com/office/drawing/2016/5/11/chartex" xmlns:cx6="http://schemas.microsoft.com/office/drawing/2016/5/12/chartex" xmlns:cx7="http://schemas.microsoft.com/office/drawing/2016/5/13/chartex" xmlns:cx8="http://schemas.microsoft.com/office/drawing/2016/5/14/chartex" xmlns:mc="http://schemas.openxmlformats.org/markup-compatibility/2006" xmlns:aink="http://schemas.microsoft.com/office/drawing/2016/ink" xmlns:am3d="http://schemas.microsoft.com/office/drawing/2017/model3d" xmlns:o="urn:schemas-microsoft-com:office:office" xmlns:oel="http://schemas.microsoft.com/office/2019/extlst" xmlns:r="http://schemas.openxmlformats.org/officeDocument/2006/relationships" xmlns:m="http://schemas.openxmlformats.org/officeDocument/2006/math" xmlns:v="urn:schemas-microsoft-com:vml" xmlns:wp14="http://schemas.microsoft.com/office/word/2010/wordprocessingDrawing" xmlns:wp="http://schemas.openxmlformats.org/drawingml/2006/wordprocessingDrawing" xmlns:w10="urn:schemas-microsoft-com:office:word" xmlns:w="http://schemas.openxmlformats.org/wordprocessingml/2006/main" xmlns:w14="http://schemas.microsoft.com/office/word/2010/wordml" xmlns:w15="http://schemas.microsoft.com/office/word/2012/wordml" xmlns:w16cex="http://schemas.microsoft.com/office/word/2018/wordml/cex" xmlns:w16cid="http://schemas.microsoft.com/office/word/2016/wordml/cid" xmlns:w16="http://schemas.microsoft.com/office/word/2018/wordml" xmlns:w16du="http://schemas.microsoft.com/office/word/2023/wordml/word16du" xmlns:w16sdtdh="http://schemas.microsoft.com/office/word/2020/wordml/sdtdatahash" xmlns:w16sdtfl="http://schemas.microsoft.com/office/word/2024/wordml/sdtformatlock" xmlns:w16se="http://schemas.microsoft.com/office/word/2015/wordml/symex" xmlns:wpg="http://schemas.microsoft.com/office/word/2010/wordprocessingGroup" xmlns:wpi="http://schemas.microsoft.com/office/word/2010/wordprocessingInk" xmlns:wne="http://schemas.microsoft.com/office/word/2006/wordml" xmlns:wps="http://schemas.microsoft.com/office/word/2010/wordprocessingShape" mc:Ignorable="w14 w15 w16se w16cid w16 w16cex w16sdtdh w16sdtfl w16du wp14">
+  <w:abstractNum w:abstractNumId="0" w15:restartNumberingAfterBreak="0">
+    <w:nsid w:val="4E112B45"/>
+    <w:multiLevelType w:val="hybridMultilevel"/>
+    <w:tmpl w:val="1130A85A"/>
+    <w:lvl w:ilvl="0" w:tplc="4409000F">
+      <w:start w:val="1"/>
+      <w:numFmt w:val="decimal"/>
+      <w:lvlText w:val="%1."/>
+      <w:lvlJc w:val="left"/>
+      <w:pPr>
+        <w:ind w:left="720" w:hanging="360"/>
+      </w:pPr>
+      <w:rPr>
+        <w:rFonts w:hint="default"/>
+      </w:rPr>
+    </w:lvl>
+    <w:lvl w:ilvl="1" w:tplc="44090019" w:tentative="1">
+      <w:start w:val="1"/>
+      <w:numFmt w:val="lowerLetter"/>
+      <w:lvlText w:val="%2."/>
+      <w:lvlJc w:val="left"/>
+      <w:pPr>
+        <w:ind w:left="1440" w:hanging="360"/>
+      </w:pPr>
+    </w:lvl>
+    <w:lvl w:ilvl="2" w:tplc="4409001B" w:tentative="1">
+      <w:start w:val="1"/>
+      <w:numFmt w:val="lowerRoman"/>
+      <w:lvlText w:val="%3."/>
+      <w:lvlJc w:val="right"/>
+      <w:pPr>
+        <w:ind w:left="2160" w:hanging="180"/>
+      </w:pPr>
+    </w:lvl>
+    <w:lvl w:ilvl="3" w:tplc="4409000F" w:tentative="1">
+      <w:start w:val="1"/>
+      <w:numFmt w:val="decimal"/>
+      <w:lvlText w:val="%4."/>
+      <w:lvlJc w:val="left"/>
+      <w:pPr>
+        <w:ind w:left="2880" w:hanging="360"/>
+      </w:pPr>
+    </w:lvl>
+    <w:lvl w:ilvl="4" w:tplc="44090019" w:tentative="1">
+      <w:start w:val="1"/>
+      <w:numFmt w:val="lowerLetter"/>
+      <w:lvlText w:val="%5."/>
+      <w:lvlJc w:val="left"/>
+      <w:pPr>
+        <w:ind w:left="3600" w:hanging="360"/>
+      </w:pPr>
+    </w:lvl>
+    <w:lvl w:ilvl="5" w:tplc="4409001B" w:tentative="1">
+      <w:start w:val="1"/>
+      <w:numFmt w:val="lowerRoman"/>
+      <w:lvlText w:val="%6."/>
+      <w:lvlJc w:val="right"/>
+      <w:pPr>
+        <w:ind w:left="4320" w:hanging="180"/>
+      </w:pPr>
+    </w:lvl>
+    <w:lvl w:ilvl="6" w:tplc="4409000F" w:tentative="1">
+      <w:start w:val="1"/>
+      <w:numFmt w:val="decimal"/>
+      <w:lvlText w:val="%7."/>
+      <w:lvlJc w:val="left"/>
+      <w:pPr>
+        <w:ind w:left="5040" w:hanging="360"/>
+      </w:pPr>
+    </w:lvl>
+    <w:lvl w:ilvl="7" w:tplc="44090019" w:tentative="1">
+      <w:start w:val="1"/>
+      <w:numFmt w:val="lowerLetter"/>
+      <w:lvlText w:val="%8."/>
+      <w:lvlJc w:val="left"/>
+      <w:pPr>
+        <w:ind w:left="5760" w:hanging="360"/>
+      </w:pPr>
+    </w:lvl>
+    <w:lvl w:ilvl="8" w:tplc="4409001B" w:tentative="1">
+      <w:start w:val="1"/>
+      <w:numFmt w:val="lowerRoman"/>
+      <w:lvlText w:val="%9."/>
+      <w:lvlJc w:val="right"/>
+      <w:pPr>
+        <w:ind w:left="6480" w:hanging="180"/>
+      </w:pPr>
+    </w:lvl>
+  </w:abstractNum>
+  <w:num w:numId="1" w16cid:durableId="492330673">
+    <w:abstractNumId w:val="0"/>
+  </w:num>
+</w:numbering>
 </file>
 
 <file path=word/styles.xml><?xml version="1.0" encoding="utf-8"?>
@@ -1848,7 +2194,6 @@
   <w:style w:type="character" w:default="1" w:styleId="DefaultParagraphFont">
     <w:name w:val="Default Paragraph Font"/>
     <w:uiPriority w:val="1"/>
-    <w:semiHidden/>
     <w:unhideWhenUsed/>
   </w:style>
   <w:style w:type="table" w:default="1" w:styleId="TableNormal">

</xml_diff>